<commit_message>
day 43 and 44
</commit_message>
<xml_diff>
--- a/Events throughout the day.docx
+++ b/Events throughout the day.docx
@@ -24211,10 +24211,7 @@
         <w:t>Title:</w:t>
       </w:r>
       <w:r>
-        <w:t xml:space="preserve"> </w:t>
-      </w:r>
-      <w:r>
-        <w:t>Finished the Arrays section in the Java masterclass course</w:t>
+        <w:t xml:space="preserve"> Finished the Arrays section in the Java masterclass course</w:t>
       </w:r>
     </w:p>
     <w:p/>
@@ -24244,7 +24241,6 @@
           <w:lang w:eastAsia="en-GB"/>
         </w:rPr>
       </w:pPr>
-      <w:bookmarkStart w:id="0" w:name="_GoBack"/>
       <w:r>
         <w:rPr>
           <w:rFonts w:ascii="Times New Roman" w:eastAsia="Times New Roman" w:hAnsi="Times New Roman" w:cs="Times New Roman"/>
@@ -24840,7 +24836,970 @@
         <w:t>Ivan</w:t>
       </w:r>
     </w:p>
-    <w:bookmarkEnd w:id="0"/>
+    <w:p/>
+    <w:p/>
+    <w:p/>
+    <w:p>
+      <w:r>
+        <w:t>Title:</w:t>
+      </w:r>
+      <w:r>
+        <w:t xml:space="preserve"> I want to finish the Esports app before day 50!</w:t>
+      </w:r>
+    </w:p>
+    <w:p/>
+    <w:p>
+      <w:r>
+        <w:t>Summary:</w:t>
+      </w:r>
+      <w:r>
+        <w:t xml:space="preserve"> Day 43 of 100. I will need to do some extra research in order to better understand interfaces, abstract </w:t>
+      </w:r>
+      <w:proofErr w:type="gramStart"/>
+      <w:r>
+        <w:t>classes</w:t>
+      </w:r>
+      <w:proofErr w:type="gramEnd"/>
+      <w:r>
+        <w:t xml:space="preserve"> and generics in Java. </w:t>
+      </w:r>
+      <w:proofErr w:type="gramStart"/>
+      <w:r>
+        <w:t>Also</w:t>
+      </w:r>
+      <w:proofErr w:type="gramEnd"/>
+      <w:r>
+        <w:t xml:space="preserve"> will aim to finish the Esports app by day 50.</w:t>
+      </w:r>
+    </w:p>
+    <w:p/>
+    <w:p>
+      <w:r>
+        <w:t>Content:</w:t>
+      </w:r>
+    </w:p>
+    <w:p>
+      <w:pPr>
+        <w:spacing w:before="100" w:beforeAutospacing="1" w:after="100" w:afterAutospacing="1" w:line="240" w:lineRule="auto"/>
+        <w:rPr>
+          <w:rFonts w:ascii="Times New Roman" w:eastAsia="Times New Roman" w:hAnsi="Times New Roman" w:cs="Times New Roman"/>
+          <w:sz w:val="24"/>
+          <w:szCs w:val="24"/>
+          <w:lang w:eastAsia="en-GB"/>
+        </w:rPr>
+      </w:pPr>
+      <w:r>
+        <w:rPr>
+          <w:rFonts w:ascii="Times New Roman" w:eastAsia="Times New Roman" w:hAnsi="Times New Roman" w:cs="Times New Roman"/>
+          <w:i/>
+          <w:iCs/>
+          <w:sz w:val="24"/>
+          <w:szCs w:val="24"/>
+          <w:lang w:eastAsia="en-GB"/>
+        </w:rPr>
+        <w:t>Welcome to day 43 of my 100 days of code...</w:t>
+      </w:r>
+    </w:p>
+    <w:p>
+      <w:pPr>
+        <w:spacing w:before="100" w:beforeAutospacing="1" w:after="100" w:afterAutospacing="1" w:line="240" w:lineRule="auto"/>
+        <w:rPr>
+          <w:rFonts w:ascii="Times New Roman" w:eastAsia="Times New Roman" w:hAnsi="Times New Roman" w:cs="Times New Roman"/>
+          <w:sz w:val="24"/>
+          <w:szCs w:val="24"/>
+          <w:lang w:eastAsia="en-GB"/>
+        </w:rPr>
+      </w:pPr>
+    </w:p>
+    <w:p>
+      <w:pPr>
+        <w:spacing w:before="100" w:beforeAutospacing="1" w:after="100" w:afterAutospacing="1" w:line="240" w:lineRule="auto"/>
+        <w:rPr>
+          <w:rFonts w:ascii="Times New Roman" w:eastAsia="Times New Roman" w:hAnsi="Times New Roman" w:cs="Times New Roman"/>
+          <w:sz w:val="24"/>
+          <w:szCs w:val="24"/>
+          <w:lang w:eastAsia="en-GB"/>
+        </w:rPr>
+      </w:pPr>
+      <w:r>
+        <w:rPr>
+          <w:rFonts w:ascii="Times New Roman" w:eastAsia="Times New Roman" w:hAnsi="Times New Roman" w:cs="Times New Roman"/>
+          <w:sz w:val="24"/>
+          <w:szCs w:val="24"/>
+          <w:lang w:eastAsia="en-GB"/>
+        </w:rPr>
+        <w:t xml:space="preserve">One of the things I did today - I went over the videos about Inner and abstract classes and generics in Java. </w:t>
+      </w:r>
+    </w:p>
+    <w:p>
+      <w:pPr>
+        <w:spacing w:before="100" w:beforeAutospacing="1" w:after="100" w:afterAutospacing="1" w:line="240" w:lineRule="auto"/>
+        <w:rPr>
+          <w:rFonts w:ascii="Times New Roman" w:eastAsia="Times New Roman" w:hAnsi="Times New Roman" w:cs="Times New Roman"/>
+          <w:sz w:val="24"/>
+          <w:szCs w:val="24"/>
+          <w:lang w:eastAsia="en-GB"/>
+        </w:rPr>
+      </w:pPr>
+      <w:r>
+        <w:rPr>
+          <w:rFonts w:ascii="Times New Roman" w:eastAsia="Times New Roman" w:hAnsi="Times New Roman" w:cs="Times New Roman"/>
+          <w:sz w:val="24"/>
+          <w:szCs w:val="24"/>
+          <w:lang w:eastAsia="en-GB"/>
+        </w:rPr>
+        <w:lastRenderedPageBreak/>
+        <w:t xml:space="preserve">I felt like I was more just listening than learning and "participating" by coding along. The concepts of abstract classes, and interfaces trouble me </w:t>
+      </w:r>
+      <w:proofErr w:type="gramStart"/>
+      <w:r>
+        <w:rPr>
+          <w:rFonts w:ascii="Times New Roman" w:eastAsia="Times New Roman" w:hAnsi="Times New Roman" w:cs="Times New Roman"/>
+          <w:sz w:val="24"/>
+          <w:szCs w:val="24"/>
+          <w:lang w:eastAsia="en-GB"/>
+        </w:rPr>
+        <w:t>at the moment</w:t>
+      </w:r>
+      <w:proofErr w:type="gramEnd"/>
+      <w:r>
+        <w:rPr>
+          <w:rFonts w:ascii="Times New Roman" w:eastAsia="Times New Roman" w:hAnsi="Times New Roman" w:cs="Times New Roman"/>
+          <w:sz w:val="24"/>
+          <w:szCs w:val="24"/>
+          <w:lang w:eastAsia="en-GB"/>
+        </w:rPr>
+        <w:t xml:space="preserve"> because I do not fully understand them, cannot use them and so I cannot see a benefit. </w:t>
+      </w:r>
+    </w:p>
+    <w:p>
+      <w:pPr>
+        <w:spacing w:before="100" w:beforeAutospacing="1" w:after="100" w:afterAutospacing="1" w:line="240" w:lineRule="auto"/>
+        <w:rPr>
+          <w:rFonts w:ascii="Times New Roman" w:eastAsia="Times New Roman" w:hAnsi="Times New Roman" w:cs="Times New Roman"/>
+          <w:sz w:val="24"/>
+          <w:szCs w:val="24"/>
+          <w:lang w:eastAsia="en-GB"/>
+        </w:rPr>
+      </w:pPr>
+      <w:r>
+        <w:rPr>
+          <w:rFonts w:ascii="Times New Roman" w:eastAsia="Times New Roman" w:hAnsi="Times New Roman" w:cs="Times New Roman"/>
+          <w:sz w:val="24"/>
+          <w:szCs w:val="24"/>
+          <w:lang w:eastAsia="en-GB"/>
+        </w:rPr>
+        <w:t xml:space="preserve">I think this is mainly </w:t>
+      </w:r>
+      <w:r>
+        <w:rPr>
+          <w:rFonts w:ascii="Times New Roman" w:eastAsia="Times New Roman" w:hAnsi="Times New Roman" w:cs="Times New Roman"/>
+          <w:sz w:val="24"/>
+          <w:szCs w:val="24"/>
+          <w:lang w:eastAsia="en-GB"/>
+        </w:rPr>
+        <w:t>because</w:t>
+      </w:r>
+      <w:r>
+        <w:rPr>
+          <w:rFonts w:ascii="Times New Roman" w:eastAsia="Times New Roman" w:hAnsi="Times New Roman" w:cs="Times New Roman"/>
+          <w:sz w:val="24"/>
+          <w:szCs w:val="24"/>
+          <w:lang w:eastAsia="en-GB"/>
+        </w:rPr>
+        <w:t xml:space="preserve"> I am going over them and it is not "easy" material. I might need to process it and do some extra research on them so I can fully understand those 2 concepts and then move forward in the course.</w:t>
+      </w:r>
+    </w:p>
+    <w:p>
+      <w:pPr>
+        <w:spacing w:before="100" w:beforeAutospacing="1" w:after="100" w:afterAutospacing="1" w:line="240" w:lineRule="auto"/>
+        <w:rPr>
+          <w:rFonts w:ascii="Times New Roman" w:eastAsia="Times New Roman" w:hAnsi="Times New Roman" w:cs="Times New Roman"/>
+          <w:sz w:val="24"/>
+          <w:szCs w:val="24"/>
+          <w:lang w:eastAsia="en-GB"/>
+        </w:rPr>
+      </w:pPr>
+    </w:p>
+    <w:p>
+      <w:pPr>
+        <w:spacing w:before="100" w:beforeAutospacing="1" w:after="100" w:afterAutospacing="1" w:line="240" w:lineRule="auto"/>
+        <w:rPr>
+          <w:rFonts w:ascii="Times New Roman" w:eastAsia="Times New Roman" w:hAnsi="Times New Roman" w:cs="Times New Roman"/>
+          <w:sz w:val="24"/>
+          <w:szCs w:val="24"/>
+          <w:lang w:eastAsia="en-GB"/>
+        </w:rPr>
+      </w:pPr>
+      <w:r>
+        <w:rPr>
+          <w:rFonts w:ascii="Times New Roman" w:eastAsia="Times New Roman" w:hAnsi="Times New Roman" w:cs="Times New Roman"/>
+          <w:sz w:val="24"/>
+          <w:szCs w:val="24"/>
+          <w:lang w:eastAsia="en-GB"/>
+        </w:rPr>
+        <w:t xml:space="preserve">The other thing I did at home was practice presenting the Python course bits that I will be doing and doing the examples, making sure my explanations are as clean as possible. It is going great so far. Today we had our second preparation meeting with the other </w:t>
+      </w:r>
+      <w:proofErr w:type="gramStart"/>
+      <w:r>
+        <w:rPr>
+          <w:rFonts w:ascii="Times New Roman" w:eastAsia="Times New Roman" w:hAnsi="Times New Roman" w:cs="Times New Roman"/>
+          <w:sz w:val="24"/>
+          <w:szCs w:val="24"/>
+          <w:lang w:eastAsia="en-GB"/>
+        </w:rPr>
+        <w:t>intern</w:t>
+      </w:r>
+      <w:proofErr w:type="gramEnd"/>
+      <w:r>
+        <w:rPr>
+          <w:rFonts w:ascii="Times New Roman" w:eastAsia="Times New Roman" w:hAnsi="Times New Roman" w:cs="Times New Roman"/>
+          <w:sz w:val="24"/>
+          <w:szCs w:val="24"/>
+          <w:lang w:eastAsia="en-GB"/>
+        </w:rPr>
+        <w:t xml:space="preserve"> and we went over all of the material together. Made sure explanations were clear and examples were easy and understandable (and working, as well, </w:t>
+      </w:r>
+      <w:proofErr w:type="spellStart"/>
+      <w:r>
+        <w:rPr>
+          <w:rFonts w:ascii="Times New Roman" w:eastAsia="Times New Roman" w:hAnsi="Times New Roman" w:cs="Times New Roman"/>
+          <w:sz w:val="24"/>
+          <w:szCs w:val="24"/>
+          <w:lang w:eastAsia="en-GB"/>
+        </w:rPr>
+        <w:t>haha</w:t>
+      </w:r>
+      <w:proofErr w:type="spellEnd"/>
+      <w:r>
+        <w:rPr>
+          <w:rFonts w:ascii="Times New Roman" w:eastAsia="Times New Roman" w:hAnsi="Times New Roman" w:cs="Times New Roman"/>
+          <w:sz w:val="24"/>
+          <w:szCs w:val="24"/>
+          <w:lang w:eastAsia="en-GB"/>
+        </w:rPr>
+        <w:t xml:space="preserve">). On Tuesday is our Test session when we will do the class for 1 intern and get its opinions and feedback before the actual thing.  </w:t>
+      </w:r>
+    </w:p>
+    <w:p>
+      <w:pPr>
+        <w:spacing w:before="100" w:beforeAutospacing="1" w:after="100" w:afterAutospacing="1" w:line="240" w:lineRule="auto"/>
+        <w:rPr>
+          <w:rFonts w:ascii="Times New Roman" w:eastAsia="Times New Roman" w:hAnsi="Times New Roman" w:cs="Times New Roman"/>
+          <w:sz w:val="24"/>
+          <w:szCs w:val="24"/>
+          <w:lang w:eastAsia="en-GB"/>
+        </w:rPr>
+      </w:pPr>
+    </w:p>
+    <w:p>
+      <w:pPr>
+        <w:spacing w:before="100" w:beforeAutospacing="1" w:after="100" w:afterAutospacing="1" w:line="240" w:lineRule="auto"/>
+        <w:rPr>
+          <w:rFonts w:ascii="Times New Roman" w:eastAsia="Times New Roman" w:hAnsi="Times New Roman" w:cs="Times New Roman"/>
+          <w:sz w:val="24"/>
+          <w:szCs w:val="24"/>
+          <w:lang w:eastAsia="en-GB"/>
+        </w:rPr>
+      </w:pPr>
+      <w:r>
+        <w:rPr>
+          <w:rFonts w:ascii="Times New Roman" w:eastAsia="Times New Roman" w:hAnsi="Times New Roman" w:cs="Times New Roman"/>
+          <w:i/>
+          <w:iCs/>
+          <w:sz w:val="24"/>
+          <w:szCs w:val="24"/>
+          <w:lang w:eastAsia="en-GB"/>
+        </w:rPr>
+        <w:t>On another note,</w:t>
+      </w:r>
+    </w:p>
+    <w:p>
+      <w:pPr>
+        <w:spacing w:before="100" w:beforeAutospacing="1" w:after="100" w:afterAutospacing="1" w:line="240" w:lineRule="auto"/>
+        <w:rPr>
+          <w:rFonts w:ascii="Times New Roman" w:eastAsia="Times New Roman" w:hAnsi="Times New Roman" w:cs="Times New Roman"/>
+          <w:sz w:val="24"/>
+          <w:szCs w:val="24"/>
+          <w:lang w:eastAsia="en-GB"/>
+        </w:rPr>
+      </w:pPr>
+    </w:p>
+    <w:p>
+      <w:pPr>
+        <w:spacing w:before="100" w:beforeAutospacing="1" w:after="100" w:afterAutospacing="1" w:line="240" w:lineRule="auto"/>
+        <w:rPr>
+          <w:rFonts w:ascii="Times New Roman" w:eastAsia="Times New Roman" w:hAnsi="Times New Roman" w:cs="Times New Roman"/>
+          <w:sz w:val="24"/>
+          <w:szCs w:val="24"/>
+          <w:lang w:eastAsia="en-GB"/>
+        </w:rPr>
+      </w:pPr>
+      <w:r>
+        <w:rPr>
+          <w:rFonts w:ascii="Times New Roman" w:eastAsia="Times New Roman" w:hAnsi="Times New Roman" w:cs="Times New Roman"/>
+          <w:sz w:val="24"/>
+          <w:szCs w:val="24"/>
+          <w:lang w:eastAsia="en-GB"/>
+        </w:rPr>
+        <w:t xml:space="preserve">Soon it will be day 50 and I wanted something important to happen before it/on it. </w:t>
+      </w:r>
+      <w:proofErr w:type="gramStart"/>
+      <w:r>
+        <w:rPr>
+          <w:rFonts w:ascii="Times New Roman" w:eastAsia="Times New Roman" w:hAnsi="Times New Roman" w:cs="Times New Roman"/>
+          <w:sz w:val="24"/>
+          <w:szCs w:val="24"/>
+          <w:lang w:eastAsia="en-GB"/>
+        </w:rPr>
+        <w:t>So</w:t>
+      </w:r>
+      <w:proofErr w:type="gramEnd"/>
+      <w:r>
+        <w:rPr>
+          <w:rFonts w:ascii="Times New Roman" w:eastAsia="Times New Roman" w:hAnsi="Times New Roman" w:cs="Times New Roman"/>
+          <w:sz w:val="24"/>
+          <w:szCs w:val="24"/>
+          <w:lang w:eastAsia="en-GB"/>
+        </w:rPr>
+        <w:t xml:space="preserve"> I will aim to finish the Esports app by day 50 which is in 1 week (7 days). Stuff that needs to be done off the top of my head:</w:t>
+      </w:r>
+    </w:p>
+    <w:p>
+      <w:pPr>
+        <w:spacing w:before="100" w:beforeAutospacing="1" w:after="100" w:afterAutospacing="1" w:line="240" w:lineRule="auto"/>
+        <w:rPr>
+          <w:rFonts w:ascii="Times New Roman" w:eastAsia="Times New Roman" w:hAnsi="Times New Roman" w:cs="Times New Roman"/>
+          <w:sz w:val="24"/>
+          <w:szCs w:val="24"/>
+          <w:lang w:eastAsia="en-GB"/>
+        </w:rPr>
+      </w:pPr>
+      <w:r>
+        <w:rPr>
+          <w:rFonts w:ascii="Times New Roman" w:eastAsia="Times New Roman" w:hAnsi="Times New Roman" w:cs="Times New Roman"/>
+          <w:sz w:val="24"/>
+          <w:szCs w:val="24"/>
+          <w:lang w:eastAsia="en-GB"/>
+        </w:rPr>
+        <w:t xml:space="preserve"> - change the API so that it accepts a list of champions and it stores it as a list in the db. </w:t>
+      </w:r>
+    </w:p>
+    <w:p>
+      <w:pPr>
+        <w:spacing w:before="100" w:beforeAutospacing="1" w:after="100" w:afterAutospacing="1" w:line="240" w:lineRule="auto"/>
+        <w:rPr>
+          <w:rFonts w:ascii="Times New Roman" w:eastAsia="Times New Roman" w:hAnsi="Times New Roman" w:cs="Times New Roman"/>
+          <w:sz w:val="24"/>
+          <w:szCs w:val="24"/>
+          <w:lang w:eastAsia="en-GB"/>
+        </w:rPr>
+      </w:pPr>
+      <w:r>
+        <w:rPr>
+          <w:rFonts w:ascii="Times New Roman" w:eastAsia="Times New Roman" w:hAnsi="Times New Roman" w:cs="Times New Roman"/>
+          <w:sz w:val="24"/>
+          <w:szCs w:val="24"/>
+          <w:lang w:eastAsia="en-GB"/>
+        </w:rPr>
+        <w:t> - make sure the update game info page works.</w:t>
+      </w:r>
+    </w:p>
+    <w:p>
+      <w:pPr>
+        <w:spacing w:before="100" w:beforeAutospacing="1" w:after="100" w:afterAutospacing="1" w:line="240" w:lineRule="auto"/>
+        <w:rPr>
+          <w:rFonts w:ascii="Times New Roman" w:eastAsia="Times New Roman" w:hAnsi="Times New Roman" w:cs="Times New Roman"/>
+          <w:sz w:val="24"/>
+          <w:szCs w:val="24"/>
+          <w:lang w:eastAsia="en-GB"/>
+        </w:rPr>
+      </w:pPr>
+      <w:r>
+        <w:rPr>
+          <w:rFonts w:ascii="Times New Roman" w:eastAsia="Times New Roman" w:hAnsi="Times New Roman" w:cs="Times New Roman"/>
+          <w:sz w:val="24"/>
+          <w:szCs w:val="24"/>
+          <w:lang w:eastAsia="en-GB"/>
+        </w:rPr>
+        <w:t xml:space="preserve"> - connect the frontend and the backend. </w:t>
+      </w:r>
+    </w:p>
+    <w:p>
+      <w:pPr>
+        <w:spacing w:before="100" w:beforeAutospacing="1" w:after="100" w:afterAutospacing="1" w:line="240" w:lineRule="auto"/>
+        <w:rPr>
+          <w:rFonts w:ascii="Times New Roman" w:eastAsia="Times New Roman" w:hAnsi="Times New Roman" w:cs="Times New Roman"/>
+          <w:sz w:val="24"/>
+          <w:szCs w:val="24"/>
+          <w:lang w:eastAsia="en-GB"/>
+        </w:rPr>
+      </w:pPr>
+    </w:p>
+    <w:p>
+      <w:pPr>
+        <w:spacing w:before="100" w:beforeAutospacing="1" w:after="100" w:afterAutospacing="1" w:line="240" w:lineRule="auto"/>
+        <w:rPr>
+          <w:rFonts w:ascii="Times New Roman" w:eastAsia="Times New Roman" w:hAnsi="Times New Roman" w:cs="Times New Roman"/>
+          <w:sz w:val="24"/>
+          <w:szCs w:val="24"/>
+          <w:lang w:eastAsia="en-GB"/>
+        </w:rPr>
+      </w:pPr>
+      <w:r>
+        <w:rPr>
+          <w:rFonts w:ascii="Times New Roman" w:eastAsia="Times New Roman" w:hAnsi="Times New Roman" w:cs="Times New Roman"/>
+          <w:sz w:val="24"/>
+          <w:szCs w:val="24"/>
+          <w:lang w:eastAsia="en-GB"/>
+        </w:rPr>
+        <w:t xml:space="preserve">It is exciting now that I am setting a deadline for it and it will </w:t>
+      </w:r>
+      <w:proofErr w:type="gramStart"/>
+      <w:r>
+        <w:rPr>
+          <w:rFonts w:ascii="Times New Roman" w:eastAsia="Times New Roman" w:hAnsi="Times New Roman" w:cs="Times New Roman"/>
+          <w:sz w:val="24"/>
+          <w:szCs w:val="24"/>
+          <w:lang w:eastAsia="en-GB"/>
+        </w:rPr>
+        <w:t>actually get</w:t>
+      </w:r>
+      <w:proofErr w:type="gramEnd"/>
+      <w:r>
+        <w:rPr>
+          <w:rFonts w:ascii="Times New Roman" w:eastAsia="Times New Roman" w:hAnsi="Times New Roman" w:cs="Times New Roman"/>
+          <w:sz w:val="24"/>
+          <w:szCs w:val="24"/>
+          <w:lang w:eastAsia="en-GB"/>
+        </w:rPr>
+        <w:t xml:space="preserve"> finished. Looking forward to working on it again!</w:t>
+      </w:r>
+    </w:p>
+    <w:p>
+      <w:pPr>
+        <w:spacing w:before="100" w:beforeAutospacing="1" w:after="100" w:afterAutospacing="1" w:line="240" w:lineRule="auto"/>
+        <w:rPr>
+          <w:rFonts w:ascii="Times New Roman" w:eastAsia="Times New Roman" w:hAnsi="Times New Roman" w:cs="Times New Roman"/>
+          <w:sz w:val="24"/>
+          <w:szCs w:val="24"/>
+          <w:lang w:eastAsia="en-GB"/>
+        </w:rPr>
+      </w:pPr>
+    </w:p>
+    <w:p>
+      <w:pPr>
+        <w:spacing w:before="100" w:beforeAutospacing="1" w:after="100" w:afterAutospacing="1" w:line="240" w:lineRule="auto"/>
+        <w:rPr>
+          <w:rFonts w:ascii="Times New Roman" w:eastAsia="Times New Roman" w:hAnsi="Times New Roman" w:cs="Times New Roman"/>
+          <w:sz w:val="24"/>
+          <w:szCs w:val="24"/>
+          <w:lang w:eastAsia="en-GB"/>
+        </w:rPr>
+      </w:pPr>
+      <w:r>
+        <w:rPr>
+          <w:rFonts w:ascii="Times New Roman" w:eastAsia="Times New Roman" w:hAnsi="Times New Roman" w:cs="Times New Roman"/>
+          <w:sz w:val="24"/>
+          <w:szCs w:val="24"/>
+          <w:lang w:eastAsia="en-GB"/>
+        </w:rPr>
+        <w:t>That is all for today.</w:t>
+      </w:r>
+    </w:p>
+    <w:p>
+      <w:pPr>
+        <w:spacing w:before="100" w:beforeAutospacing="1" w:after="100" w:afterAutospacing="1" w:line="240" w:lineRule="auto"/>
+        <w:rPr>
+          <w:rFonts w:ascii="Times New Roman" w:eastAsia="Times New Roman" w:hAnsi="Times New Roman" w:cs="Times New Roman"/>
+          <w:sz w:val="24"/>
+          <w:szCs w:val="24"/>
+          <w:lang w:eastAsia="en-GB"/>
+        </w:rPr>
+      </w:pPr>
+    </w:p>
+    <w:p>
+      <w:pPr>
+        <w:spacing w:before="100" w:beforeAutospacing="1" w:after="100" w:afterAutospacing="1" w:line="240" w:lineRule="auto"/>
+        <w:rPr>
+          <w:rFonts w:ascii="Times New Roman" w:eastAsia="Times New Roman" w:hAnsi="Times New Roman" w:cs="Times New Roman"/>
+          <w:sz w:val="24"/>
+          <w:szCs w:val="24"/>
+          <w:lang w:eastAsia="en-GB"/>
+        </w:rPr>
+      </w:pPr>
+      <w:r>
+        <w:rPr>
+          <w:rFonts w:ascii="Times New Roman" w:eastAsia="Times New Roman" w:hAnsi="Times New Roman" w:cs="Times New Roman"/>
+          <w:sz w:val="24"/>
+          <w:szCs w:val="24"/>
+          <w:lang w:eastAsia="en-GB"/>
+        </w:rPr>
+        <w:t>See you in the next one,</w:t>
+      </w:r>
+    </w:p>
+    <w:p>
+      <w:pPr>
+        <w:spacing w:before="100" w:beforeAutospacing="1" w:after="100" w:afterAutospacing="1" w:line="240" w:lineRule="auto"/>
+        <w:rPr>
+          <w:rFonts w:ascii="Times New Roman" w:eastAsia="Times New Roman" w:hAnsi="Times New Roman" w:cs="Times New Roman"/>
+          <w:sz w:val="24"/>
+          <w:szCs w:val="24"/>
+          <w:lang w:eastAsia="en-GB"/>
+        </w:rPr>
+      </w:pPr>
+      <w:r>
+        <w:rPr>
+          <w:rFonts w:ascii="Times New Roman" w:eastAsia="Times New Roman" w:hAnsi="Times New Roman" w:cs="Times New Roman"/>
+          <w:sz w:val="24"/>
+          <w:szCs w:val="24"/>
+          <w:lang w:eastAsia="en-GB"/>
+        </w:rPr>
+        <w:lastRenderedPageBreak/>
+        <w:t>Ivan</w:t>
+      </w:r>
+    </w:p>
+    <w:p/>
+    <w:p/>
+    <w:p>
+      <w:r>
+        <w:t>Title:</w:t>
+      </w:r>
+      <w:r>
+        <w:t xml:space="preserve"> Connecting the frontend and the backend of my Esports app</w:t>
+      </w:r>
+    </w:p>
+    <w:p/>
+    <w:p>
+      <w:r>
+        <w:t>Summary:</w:t>
+      </w:r>
+      <w:r>
+        <w:t xml:space="preserve"> </w:t>
+      </w:r>
+      <w:r>
+        <w:t>Day 44 of 100. Amazing how APIs work. Everything on the frontend is coming from permanent saves of data in a database. (Also need to start making improvements to my frontend code)</w:t>
+      </w:r>
+    </w:p>
+    <w:p>
+      <w:r>
+        <w:t>Content:</w:t>
+      </w:r>
+      <w:bookmarkStart w:id="0" w:name="_GoBack"/>
+      <w:bookmarkEnd w:id="0"/>
+    </w:p>
+    <w:p>
+      <w:pPr>
+        <w:pStyle w:val="NormalWeb"/>
+      </w:pPr>
+      <w:r>
+        <w:rPr>
+          <w:rStyle w:val="Emphasis"/>
+        </w:rPr>
+        <w:t xml:space="preserve">Welcome to day 44's post. </w:t>
+      </w:r>
+    </w:p>
+    <w:p>
+      <w:pPr>
+        <w:pStyle w:val="NormalWeb"/>
+      </w:pPr>
+    </w:p>
+    <w:p>
+      <w:pPr>
+        <w:pStyle w:val="NormalWeb"/>
+      </w:pPr>
+      <w:r>
+        <w:t>As I have done the last 2 weekends, I will be posting about Friday's and Saturday's coding in the morning of the next day.</w:t>
+      </w:r>
+    </w:p>
+    <w:p>
+      <w:pPr>
+        <w:pStyle w:val="NormalWeb"/>
+      </w:pPr>
+    </w:p>
+    <w:p>
+      <w:pPr>
+        <w:pStyle w:val="Heading3"/>
+      </w:pPr>
+      <w:r>
+        <w:t>Well, yesterday I went back to my Esports app (I removed the dust because I had not touched or looked at the code for at least 2 weeks).</w:t>
+      </w:r>
+    </w:p>
+    <w:p>
+      <w:pPr>
+        <w:pStyle w:val="NormalWeb"/>
+      </w:pPr>
+    </w:p>
+    <w:p>
+      <w:pPr>
+        <w:pStyle w:val="NormalWeb"/>
+      </w:pPr>
+      <w:r>
+        <w:t xml:space="preserve">First thing I wanted to do was the update the API so that instead of duration (a number) it accepts and processes an array of champions. I started laughing when I </w:t>
+      </w:r>
+      <w:r>
+        <w:t>began</w:t>
+      </w:r>
+      <w:r>
+        <w:t xml:space="preserve"> reading my backend code again,</w:t>
+      </w:r>
+      <w:r>
+        <w:t xml:space="preserve"> </w:t>
+      </w:r>
+      <w:r>
+        <w:t xml:space="preserve">not because it is bad, it might </w:t>
+      </w:r>
+      <w:proofErr w:type="gramStart"/>
+      <w:r>
+        <w:t>be</w:t>
+      </w:r>
+      <w:proofErr w:type="gramEnd"/>
+      <w:r>
+        <w:t xml:space="preserve"> but I would not say so, but because I felt like I did not remember anything of what it did (</w:t>
+      </w:r>
+      <w:proofErr w:type="spellStart"/>
+      <w:r>
+        <w:t>hahaha</w:t>
+      </w:r>
+      <w:proofErr w:type="spellEnd"/>
+      <w:r>
+        <w:t xml:space="preserve">). I knew what endpoints I had and what info I could get. I needed to quickly remind myself of where is what and thankfully it took me couple of minutes of reading and following my code to once again, know it completely. I needed to know where to change duration(int) to champions(array) and what else will be affected by this change. </w:t>
+      </w:r>
+    </w:p>
+    <w:p>
+      <w:pPr>
+        <w:pStyle w:val="NormalWeb"/>
+      </w:pPr>
+    </w:p>
+    <w:p>
+      <w:pPr>
+        <w:pStyle w:val="NormalWeb"/>
+      </w:pPr>
+      <w:r>
+        <w:t>Thankfully, it did not take much time to remember my code and I made the change which was not that big - I changed the mongoose Schema for a game from having duration as a Number to champions as Array data type, and also minor changes along some of the API endpoints.</w:t>
+      </w:r>
+    </w:p>
+    <w:p>
+      <w:pPr>
+        <w:pStyle w:val="NormalWeb"/>
+      </w:pPr>
+    </w:p>
+    <w:p>
+      <w:pPr>
+        <w:pStyle w:val="NormalWeb"/>
+      </w:pPr>
+      <w:r>
+        <w:t xml:space="preserve">Before connecting frontend and backend I wanted to make sure that I was happy with the functionality I had on the frontend - whether buttons work and data (hard-coded data) is read and presented properly. </w:t>
+      </w:r>
+    </w:p>
+    <w:p>
+      <w:pPr>
+        <w:pStyle w:val="NormalWeb"/>
+      </w:pPr>
+      <w:r>
+        <w:lastRenderedPageBreak/>
+        <w:t xml:space="preserve">I ran into one issue - the update info button did not actually work. I had the button, a modal opens with the current game info, but I was not happy with the input fields I had put </w:t>
+      </w:r>
+      <w:proofErr w:type="gramStart"/>
+      <w:r>
+        <w:t>and also</w:t>
+      </w:r>
+      <w:proofErr w:type="gramEnd"/>
+      <w:r>
+        <w:t xml:space="preserve"> the "submit changes" button did not do anything. I am blaming myself here for not doing this correctly (Of course I am blaming </w:t>
+      </w:r>
+      <w:proofErr w:type="gramStart"/>
+      <w:r>
+        <w:t>myself,</w:t>
+      </w:r>
+      <w:proofErr w:type="gramEnd"/>
+      <w:r>
+        <w:t xml:space="preserve"> it is not like someone else works on this </w:t>
+      </w:r>
+      <w:proofErr w:type="spellStart"/>
+      <w:r>
+        <w:t>haha</w:t>
+      </w:r>
+      <w:proofErr w:type="spellEnd"/>
+      <w:r>
+        <w:t xml:space="preserve">). </w:t>
+      </w:r>
+    </w:p>
+    <w:p>
+      <w:pPr>
+        <w:pStyle w:val="NormalWeb"/>
+      </w:pPr>
+    </w:p>
+    <w:p>
+      <w:pPr>
+        <w:pStyle w:val="NormalWeb"/>
+      </w:pPr>
+      <w:r>
+        <w:t xml:space="preserve">Because my goal for the night was to connect the frontend and the </w:t>
+      </w:r>
+      <w:proofErr w:type="gramStart"/>
+      <w:r>
+        <w:t>backend</w:t>
+      </w:r>
+      <w:proofErr w:type="gramEnd"/>
+      <w:r>
+        <w:t xml:space="preserve"> I made the decision to comment out the code of the "update game info" button. I wanted the two pieces connected and even if some functionality is not there yet, I can add it later.</w:t>
+      </w:r>
+    </w:p>
+    <w:p>
+      <w:pPr>
+        <w:pStyle w:val="NormalWeb"/>
+      </w:pPr>
+      <w:r>
+        <w:t>One of the things I learned so far in programming is:</w:t>
+      </w:r>
+    </w:p>
+    <w:p>
+      <w:pPr>
+        <w:pStyle w:val="NormalWeb"/>
+      </w:pPr>
+      <w:r>
+        <w:t xml:space="preserve">- </w:t>
+      </w:r>
+      <w:r>
+        <w:rPr>
+          <w:rStyle w:val="Strong"/>
+        </w:rPr>
+        <w:t xml:space="preserve">first: </w:t>
+      </w:r>
+      <w:r>
+        <w:t>write code that works</w:t>
+      </w:r>
+    </w:p>
+    <w:p>
+      <w:pPr>
+        <w:pStyle w:val="NormalWeb"/>
+      </w:pPr>
+      <w:r>
+        <w:t xml:space="preserve">- </w:t>
+      </w:r>
+      <w:r>
+        <w:rPr>
+          <w:rStyle w:val="Strong"/>
+        </w:rPr>
+        <w:t xml:space="preserve">second: </w:t>
+      </w:r>
+      <w:r>
+        <w:t>improve that code</w:t>
+      </w:r>
+    </w:p>
+    <w:p>
+      <w:pPr>
+        <w:pStyle w:val="NormalWeb"/>
+      </w:pPr>
+      <w:r>
+        <w:t>I find it very important to make gradual moves up until the point where the code is flexible, nothing is hard-</w:t>
+      </w:r>
+      <w:proofErr w:type="gramStart"/>
+      <w:r>
+        <w:t>coded</w:t>
+      </w:r>
+      <w:proofErr w:type="gramEnd"/>
+      <w:r>
+        <w:t xml:space="preserve"> and you are happy with it. It is important to have something working in the first place and from there I can improve it. I feel this method is nice for learners because our minds (or at least mine) are not yet trained to immediately be able to write the most efficient code. If I initially write some code that works (even though it is bad) afterwards I know where I can improve it and make it better. </w:t>
+      </w:r>
+    </w:p>
+    <w:p>
+      <w:pPr>
+        <w:pStyle w:val="NormalWeb"/>
+      </w:pPr>
+    </w:p>
+    <w:p>
+      <w:pPr>
+        <w:pStyle w:val="NormalWeb"/>
+      </w:pPr>
+      <w:r>
+        <w:t xml:space="preserve">So, I commented the update game info code and continued with the connection. </w:t>
+      </w:r>
+    </w:p>
+    <w:p>
+      <w:pPr>
+        <w:pStyle w:val="NormalWeb"/>
+      </w:pPr>
+      <w:r>
+        <w:t xml:space="preserve">The first endpoint I connected was the "Add game" page/functionality. A fetch with a POST method, headers, </w:t>
+      </w:r>
+      <w:proofErr w:type="gramStart"/>
+      <w:r>
+        <w:t>body</w:t>
+      </w:r>
+      <w:proofErr w:type="gramEnd"/>
+      <w:r>
+        <w:t xml:space="preserve"> and I had the ability to add games to the database. Immediately after I added the "View all" page. Where I do GET all the games in the database and show them. The other 2 endpoints that I connected are GET all games by a certain team and the "View game info" page - where I see the full game information about a certain game (for context, on each game which is shown as a Card, I have a "View info" button and after its click I am taken to this page with full game info that I have). </w:t>
+      </w:r>
+    </w:p>
+    <w:p>
+      <w:pPr>
+        <w:pStyle w:val="NormalWeb"/>
+      </w:pPr>
+    </w:p>
+    <w:p>
+      <w:pPr>
+        <w:pStyle w:val="NormalWeb"/>
+      </w:pPr>
+      <w:r>
+        <w:t>Seeing how I am adding games from the frontend and then seeing those games again in the "View all" page was amazing. It was really exciting how I am clicking some buttons on the website and everything goes and is saved to a database.</w:t>
+      </w:r>
+    </w:p>
+    <w:p>
+      <w:pPr>
+        <w:pStyle w:val="NormalWeb"/>
+      </w:pPr>
+    </w:p>
+    <w:p>
+      <w:pPr>
+        <w:pStyle w:val="NormalWeb"/>
+      </w:pPr>
+      <w:r>
+        <w:t xml:space="preserve">There are some obvious problems for me which I knew will be there after I connected the front and the back. The frontend code is not that good. Code is repeated a lot and some of the </w:t>
+      </w:r>
+      <w:r>
+        <w:lastRenderedPageBreak/>
+        <w:t xml:space="preserve">validation is not </w:t>
+      </w:r>
+      <w:proofErr w:type="gramStart"/>
+      <w:r>
+        <w:t>very good</w:t>
+      </w:r>
+      <w:proofErr w:type="gramEnd"/>
+      <w:r>
+        <w:t xml:space="preserve">. As I mentioned previously in this post, I wanted to have something that works. Thankfully, during development I </w:t>
+      </w:r>
+      <w:proofErr w:type="spellStart"/>
+      <w:r>
+        <w:t>realise</w:t>
+      </w:r>
+      <w:proofErr w:type="spellEnd"/>
+      <w:r>
+        <w:t xml:space="preserve"> what needs to be improved and how it can be </w:t>
+      </w:r>
+      <w:proofErr w:type="gramStart"/>
+      <w:r>
+        <w:t>improved</w:t>
+      </w:r>
+      <w:proofErr w:type="gramEnd"/>
+      <w:r>
+        <w:t xml:space="preserve"> and I took notes.   </w:t>
+      </w:r>
+    </w:p>
+    <w:p>
+      <w:pPr>
+        <w:pStyle w:val="NormalWeb"/>
+      </w:pPr>
+    </w:p>
+    <w:p>
+      <w:pPr>
+        <w:pStyle w:val="Heading3"/>
+      </w:pPr>
+      <w:r>
+        <w:t xml:space="preserve">What is </w:t>
+      </w:r>
+      <w:proofErr w:type="gramStart"/>
+      <w:r>
+        <w:t>next ?</w:t>
+      </w:r>
+      <w:proofErr w:type="gramEnd"/>
+    </w:p>
+    <w:p>
+      <w:pPr>
+        <w:pStyle w:val="NormalWeb"/>
+      </w:pPr>
+    </w:p>
+    <w:p>
+      <w:pPr>
+        <w:pStyle w:val="NormalWeb"/>
+      </w:pPr>
+      <w:r>
+        <w:t xml:space="preserve">Well, immediate next actions are </w:t>
+      </w:r>
+      <w:proofErr w:type="gramStart"/>
+      <w:r>
+        <w:t>make</w:t>
+      </w:r>
+      <w:proofErr w:type="gramEnd"/>
+      <w:r>
+        <w:t xml:space="preserve"> the frontend code better. Create components for repeated code. </w:t>
+      </w:r>
+    </w:p>
+    <w:p>
+      <w:pPr>
+        <w:pStyle w:val="NormalWeb"/>
+      </w:pPr>
+      <w:r>
+        <w:t>Some main things to improve:</w:t>
+      </w:r>
+    </w:p>
+    <w:p>
+      <w:pPr>
+        <w:pStyle w:val="NormalWeb"/>
+      </w:pPr>
+      <w:r>
+        <w:t xml:space="preserve"> - setup the error validation that is </w:t>
+      </w:r>
+      <w:proofErr w:type="spellStart"/>
+      <w:r>
+        <w:t>comming</w:t>
+      </w:r>
+      <w:proofErr w:type="spellEnd"/>
+      <w:r>
+        <w:t xml:space="preserve"> from the backend</w:t>
+      </w:r>
+    </w:p>
+    <w:p>
+      <w:pPr>
+        <w:pStyle w:val="NormalWeb"/>
+      </w:pPr>
+      <w:r>
+        <w:t> - add a loading spinner for when I am fetching data</w:t>
+      </w:r>
+    </w:p>
+    <w:p>
+      <w:pPr>
+        <w:pStyle w:val="NormalWeb"/>
+      </w:pPr>
+      <w:r>
+        <w:t> - create components for repeated code</w:t>
+      </w:r>
+    </w:p>
+    <w:p>
+      <w:pPr>
+        <w:pStyle w:val="NormalWeb"/>
+      </w:pPr>
+    </w:p>
+    <w:p>
+      <w:pPr>
+        <w:pStyle w:val="NormalWeb"/>
+      </w:pPr>
+      <w:r>
+        <w:t>That is all for Friday.</w:t>
+      </w:r>
+    </w:p>
+    <w:p>
+      <w:pPr>
+        <w:pStyle w:val="NormalWeb"/>
+      </w:pPr>
+    </w:p>
+    <w:p>
+      <w:pPr>
+        <w:pStyle w:val="NormalWeb"/>
+      </w:pPr>
+      <w:r>
+        <w:t>See you in the next one,</w:t>
+      </w:r>
+    </w:p>
+    <w:p>
+      <w:pPr>
+        <w:pStyle w:val="NormalWeb"/>
+      </w:pPr>
+      <w:r>
+        <w:t>Ivan</w:t>
+      </w:r>
+    </w:p>
     <w:p/>
     <w:sectPr>
       <w:pgSz w:w="12240" w:h="15840"/>

</xml_diff>